<commit_message>
fix(documents): default blank DOCX proofing language to Turkish
</commit_message>
<xml_diff>
--- a/deploy/office/blank.docx
+++ b/deploy/office/blank.docx
@@ -2,7 +2,29 @@
 <file path=word/document.xml><?xml version="1.0" encoding="utf-8"?>
 <w:document xmlns:w="http://schemas.openxmlformats.org/wordprocessingml/2006/main">
   <w:body>
-    <w:p/>
+    <w:p>
+      <w:pPr>
+        <w:rPr>
+          <w:lang w:val="tr-TR" w:eastAsia="tr-TR" w:bidi="tr-TR"/>
+        </w:rPr>
+      </w:pPr>
+    </w:p>
+    <w:sectPr/>
   </w:body>
 </w:document>
+</file>
+
+<file path=word/styles.xml><?xml version="1.0" encoding="utf-8"?>
+<w:styles xmlns:w="http://schemas.openxmlformats.org/wordprocessingml/2006/main">
+  <w:docDefaults>
+    <w:rPrDefault>
+      <w:rPr>
+        <w:lang w:val="tr-TR" w:eastAsia="tr-TR" w:bidi="tr-TR"/>
+      </w:rPr>
+    </w:rPrDefault>
+    <w:pPrDefault>
+      <w:pPr/>
+    </w:pPrDefault>
+  </w:docDefaults>
+</w:styles>
 </file>
</xml_diff>